<commit_message>
adding save documment and screen shots for week 7 day 1 demo submission
</commit_message>
<xml_diff>
--- a/Week7-Day1-DemoSubmission - Screen Shots.docx
+++ b/Week7-Day1-DemoSubmission - Screen Shots.docx
@@ -2284,6 +2284,574 @@
                     <a:xfrm>
                       <a:off x="0" y="0"/>
                       <a:ext cx="3772426" cy="743054"/>
+                    </a:xfrm>
+                    <a:prstGeom prst="rect">
+                      <a:avLst/>
+                    </a:prstGeom>
+                  </pic:spPr>
+                </pic:pic>
+              </a:graphicData>
+            </a:graphic>
+          </wp:inline>
+        </w:drawing>
+      </w:r>
+    </w:p>
+    <w:p>
+      <w:pPr>
+        <w:pBdr>
+          <w:top w:val="nil"/>
+          <w:left w:val="nil"/>
+          <w:bottom w:val="nil"/>
+          <w:right w:val="nil"/>
+          <w:between w:val="nil"/>
+        </w:pBdr>
+        <w:spacing w:after="0" w:line="480" w:lineRule="auto"/>
+        <w:jc w:val="center"/>
+        <w:rPr>
+          <w:rFonts w:ascii="Times New Roman" w:eastAsia="Times New Roman" w:hAnsi="Times New Roman" w:cs="Times New Roman"/>
+          <w:sz w:val="24"/>
+          <w:szCs w:val="24"/>
+          <w:lang w:eastAsia="en-US"/>
+          <w14:ligatures w14:val="none"/>
+        </w:rPr>
+      </w:pPr>
+      <w:r>
+        <w:rPr>
+          <w:rFonts w:ascii="Times New Roman" w:eastAsia="Times New Roman" w:hAnsi="Times New Roman" w:cs="Times New Roman"/>
+          <w:sz w:val="24"/>
+          <w:szCs w:val="24"/>
+          <w:lang w:eastAsia="en-US"/>
+          <w14:ligatures w14:val="none"/>
+        </w:rPr>
+        <w:drawing>
+          <wp:inline distT="0" distB="0" distL="0" distR="0" wp14:anchorId="782099F8" wp14:editId="15BFB09D">
+            <wp:extent cx="3334215" cy="733527"/>
+            <wp:effectExtent l="0" t="0" r="0" b="9525"/>
+            <wp:docPr id="688271926" name="Imagen 1"/>
+            <wp:cNvGraphicFramePr>
+              <a:graphicFrameLocks xmlns:a="http://schemas.openxmlformats.org/drawingml/2006/main" noChangeAspect="1"/>
+            </wp:cNvGraphicFramePr>
+            <a:graphic xmlns:a="http://schemas.openxmlformats.org/drawingml/2006/main">
+              <a:graphicData uri="http://schemas.openxmlformats.org/drawingml/2006/picture">
+                <pic:pic xmlns:pic="http://schemas.openxmlformats.org/drawingml/2006/picture">
+                  <pic:nvPicPr>
+                    <pic:cNvPr id="688271926" name=""/>
+                    <pic:cNvPicPr/>
+                  </pic:nvPicPr>
+                  <pic:blipFill>
+                    <a:blip r:embed="rId28"/>
+                    <a:stretch>
+                      <a:fillRect/>
+                    </a:stretch>
+                  </pic:blipFill>
+                  <pic:spPr>
+                    <a:xfrm>
+                      <a:off x="0" y="0"/>
+                      <a:ext cx="3334215" cy="733527"/>
+                    </a:xfrm>
+                    <a:prstGeom prst="rect">
+                      <a:avLst/>
+                    </a:prstGeom>
+                  </pic:spPr>
+                </pic:pic>
+              </a:graphicData>
+            </a:graphic>
+          </wp:inline>
+        </w:drawing>
+      </w:r>
+    </w:p>
+    <w:p>
+      <w:pPr>
+        <w:pBdr>
+          <w:top w:val="nil"/>
+          <w:left w:val="nil"/>
+          <w:bottom w:val="nil"/>
+          <w:right w:val="nil"/>
+          <w:between w:val="nil"/>
+        </w:pBdr>
+        <w:spacing w:after="0" w:line="480" w:lineRule="auto"/>
+        <w:jc w:val="center"/>
+        <w:rPr>
+          <w:rFonts w:ascii="Times New Roman" w:eastAsia="Times New Roman" w:hAnsi="Times New Roman" w:cs="Times New Roman"/>
+          <w:sz w:val="24"/>
+          <w:szCs w:val="24"/>
+          <w:lang w:eastAsia="en-US"/>
+          <w14:ligatures w14:val="none"/>
+        </w:rPr>
+      </w:pPr>
+    </w:p>
+    <w:p>
+      <w:pPr>
+        <w:pBdr>
+          <w:top w:val="nil"/>
+          <w:left w:val="nil"/>
+          <w:bottom w:val="nil"/>
+          <w:right w:val="nil"/>
+          <w:between w:val="nil"/>
+        </w:pBdr>
+        <w:spacing w:after="0" w:line="480" w:lineRule="auto"/>
+        <w:jc w:val="center"/>
+        <w:rPr>
+          <w:rFonts w:ascii="Times New Roman" w:eastAsia="Times New Roman" w:hAnsi="Times New Roman" w:cs="Times New Roman"/>
+          <w:sz w:val="24"/>
+          <w:szCs w:val="24"/>
+          <w:lang w:eastAsia="en-US"/>
+          <w14:ligatures w14:val="none"/>
+        </w:rPr>
+      </w:pPr>
+      <w:r>
+        <w:rPr>
+          <w:rFonts w:ascii="Times New Roman" w:eastAsia="Times New Roman" w:hAnsi="Times New Roman" w:cs="Times New Roman"/>
+          <w:sz w:val="24"/>
+          <w:szCs w:val="24"/>
+          <w:lang w:eastAsia="en-US"/>
+          <w14:ligatures w14:val="none"/>
+        </w:rPr>
+        <w:drawing>
+          <wp:inline distT="0" distB="0" distL="0" distR="0" wp14:anchorId="1C8B0026" wp14:editId="1B917B3D">
+            <wp:extent cx="1886213" cy="885949"/>
+            <wp:effectExtent l="0" t="0" r="0" b="9525"/>
+            <wp:docPr id="308598903" name="Imagen 1"/>
+            <wp:cNvGraphicFramePr>
+              <a:graphicFrameLocks xmlns:a="http://schemas.openxmlformats.org/drawingml/2006/main" noChangeAspect="1"/>
+            </wp:cNvGraphicFramePr>
+            <a:graphic xmlns:a="http://schemas.openxmlformats.org/drawingml/2006/main">
+              <a:graphicData uri="http://schemas.openxmlformats.org/drawingml/2006/picture">
+                <pic:pic xmlns:pic="http://schemas.openxmlformats.org/drawingml/2006/picture">
+                  <pic:nvPicPr>
+                    <pic:cNvPr id="308598903" name=""/>
+                    <pic:cNvPicPr/>
+                  </pic:nvPicPr>
+                  <pic:blipFill>
+                    <a:blip r:embed="rId29"/>
+                    <a:stretch>
+                      <a:fillRect/>
+                    </a:stretch>
+                  </pic:blipFill>
+                  <pic:spPr>
+                    <a:xfrm>
+                      <a:off x="0" y="0"/>
+                      <a:ext cx="1886213" cy="885949"/>
+                    </a:xfrm>
+                    <a:prstGeom prst="rect">
+                      <a:avLst/>
+                    </a:prstGeom>
+                  </pic:spPr>
+                </pic:pic>
+              </a:graphicData>
+            </a:graphic>
+          </wp:inline>
+        </w:drawing>
+      </w:r>
+    </w:p>
+    <w:p>
+      <w:pPr>
+        <w:pBdr>
+          <w:top w:val="nil"/>
+          <w:left w:val="nil"/>
+          <w:bottom w:val="nil"/>
+          <w:right w:val="nil"/>
+          <w:between w:val="nil"/>
+        </w:pBdr>
+        <w:spacing w:after="0" w:line="480" w:lineRule="auto"/>
+        <w:jc w:val="center"/>
+        <w:rPr>
+          <w:rFonts w:ascii="Times New Roman" w:eastAsia="Times New Roman" w:hAnsi="Times New Roman" w:cs="Times New Roman"/>
+          <w:sz w:val="24"/>
+          <w:szCs w:val="24"/>
+          <w:lang w:eastAsia="en-US"/>
+          <w14:ligatures w14:val="none"/>
+        </w:rPr>
+      </w:pPr>
+      <w:r>
+        <w:rPr>
+          <w:rFonts w:ascii="Times New Roman" w:eastAsia="Times New Roman" w:hAnsi="Times New Roman" w:cs="Times New Roman"/>
+          <w:sz w:val="24"/>
+          <w:szCs w:val="24"/>
+          <w:lang w:eastAsia="en-US"/>
+          <w14:ligatures w14:val="none"/>
+        </w:rPr>
+        <w:drawing>
+          <wp:inline distT="0" distB="0" distL="0" distR="0" wp14:anchorId="68A09550" wp14:editId="738D0217">
+            <wp:extent cx="2048161" cy="1009791"/>
+            <wp:effectExtent l="0" t="0" r="9525" b="0"/>
+            <wp:docPr id="245523715" name="Imagen 1"/>
+            <wp:cNvGraphicFramePr>
+              <a:graphicFrameLocks xmlns:a="http://schemas.openxmlformats.org/drawingml/2006/main" noChangeAspect="1"/>
+            </wp:cNvGraphicFramePr>
+            <a:graphic xmlns:a="http://schemas.openxmlformats.org/drawingml/2006/main">
+              <a:graphicData uri="http://schemas.openxmlformats.org/drawingml/2006/picture">
+                <pic:pic xmlns:pic="http://schemas.openxmlformats.org/drawingml/2006/picture">
+                  <pic:nvPicPr>
+                    <pic:cNvPr id="245523715" name=""/>
+                    <pic:cNvPicPr/>
+                  </pic:nvPicPr>
+                  <pic:blipFill>
+                    <a:blip r:embed="rId30"/>
+                    <a:stretch>
+                      <a:fillRect/>
+                    </a:stretch>
+                  </pic:blipFill>
+                  <pic:spPr>
+                    <a:xfrm>
+                      <a:off x="0" y="0"/>
+                      <a:ext cx="2048161" cy="1009791"/>
+                    </a:xfrm>
+                    <a:prstGeom prst="rect">
+                      <a:avLst/>
+                    </a:prstGeom>
+                  </pic:spPr>
+                </pic:pic>
+              </a:graphicData>
+            </a:graphic>
+          </wp:inline>
+        </w:drawing>
+      </w:r>
+    </w:p>
+    <w:p>
+      <w:pPr>
+        <w:pBdr>
+          <w:top w:val="nil"/>
+          <w:left w:val="nil"/>
+          <w:bottom w:val="nil"/>
+          <w:right w:val="nil"/>
+          <w:between w:val="nil"/>
+        </w:pBdr>
+        <w:spacing w:after="0" w:line="480" w:lineRule="auto"/>
+        <w:jc w:val="center"/>
+        <w:rPr>
+          <w:rFonts w:ascii="Times New Roman" w:eastAsia="Times New Roman" w:hAnsi="Times New Roman" w:cs="Times New Roman"/>
+          <w:sz w:val="24"/>
+          <w:szCs w:val="24"/>
+          <w:lang w:eastAsia="en-US"/>
+          <w14:ligatures w14:val="none"/>
+        </w:rPr>
+      </w:pPr>
+    </w:p>
+    <w:p>
+      <w:pPr>
+        <w:pBdr>
+          <w:top w:val="nil"/>
+          <w:left w:val="nil"/>
+          <w:bottom w:val="nil"/>
+          <w:right w:val="nil"/>
+          <w:between w:val="nil"/>
+        </w:pBdr>
+        <w:spacing w:after="0" w:line="480" w:lineRule="auto"/>
+        <w:jc w:val="center"/>
+        <w:rPr>
+          <w:rFonts w:ascii="Times New Roman" w:eastAsia="Times New Roman" w:hAnsi="Times New Roman" w:cs="Times New Roman"/>
+          <w:sz w:val="24"/>
+          <w:szCs w:val="24"/>
+          <w:lang w:eastAsia="en-US"/>
+          <w14:ligatures w14:val="none"/>
+        </w:rPr>
+      </w:pPr>
+      <w:r>
+        <w:rPr>
+          <w:rFonts w:ascii="Times New Roman" w:eastAsia="Times New Roman" w:hAnsi="Times New Roman" w:cs="Times New Roman"/>
+          <w:sz w:val="24"/>
+          <w:szCs w:val="24"/>
+          <w:lang w:eastAsia="en-US"/>
+          <w14:ligatures w14:val="none"/>
+        </w:rPr>
+        <w:drawing>
+          <wp:inline distT="0" distB="0" distL="0" distR="0" wp14:anchorId="250ABE22" wp14:editId="282CDFC4">
+            <wp:extent cx="3620005" cy="838317"/>
+            <wp:effectExtent l="0" t="0" r="0" b="0"/>
+            <wp:docPr id="1224704475" name="Imagen 1"/>
+            <wp:cNvGraphicFramePr>
+              <a:graphicFrameLocks xmlns:a="http://schemas.openxmlformats.org/drawingml/2006/main" noChangeAspect="1"/>
+            </wp:cNvGraphicFramePr>
+            <a:graphic xmlns:a="http://schemas.openxmlformats.org/drawingml/2006/main">
+              <a:graphicData uri="http://schemas.openxmlformats.org/drawingml/2006/picture">
+                <pic:pic xmlns:pic="http://schemas.openxmlformats.org/drawingml/2006/picture">
+                  <pic:nvPicPr>
+                    <pic:cNvPr id="1224704475" name=""/>
+                    <pic:cNvPicPr/>
+                  </pic:nvPicPr>
+                  <pic:blipFill>
+                    <a:blip r:embed="rId31"/>
+                    <a:stretch>
+                      <a:fillRect/>
+                    </a:stretch>
+                  </pic:blipFill>
+                  <pic:spPr>
+                    <a:xfrm>
+                      <a:off x="0" y="0"/>
+                      <a:ext cx="3620005" cy="838317"/>
+                    </a:xfrm>
+                    <a:prstGeom prst="rect">
+                      <a:avLst/>
+                    </a:prstGeom>
+                  </pic:spPr>
+                </pic:pic>
+              </a:graphicData>
+            </a:graphic>
+          </wp:inline>
+        </w:drawing>
+      </w:r>
+    </w:p>
+    <w:p>
+      <w:pPr>
+        <w:pBdr>
+          <w:top w:val="nil"/>
+          <w:left w:val="nil"/>
+          <w:bottom w:val="nil"/>
+          <w:right w:val="nil"/>
+          <w:between w:val="nil"/>
+        </w:pBdr>
+        <w:spacing w:after="0" w:line="480" w:lineRule="auto"/>
+        <w:jc w:val="center"/>
+        <w:rPr>
+          <w:rFonts w:ascii="Times New Roman" w:eastAsia="Times New Roman" w:hAnsi="Times New Roman" w:cs="Times New Roman"/>
+          <w:sz w:val="24"/>
+          <w:szCs w:val="24"/>
+          <w:lang w:eastAsia="en-US"/>
+          <w14:ligatures w14:val="none"/>
+        </w:rPr>
+      </w:pPr>
+    </w:p>
+    <w:p>
+      <w:pPr>
+        <w:pBdr>
+          <w:top w:val="nil"/>
+          <w:left w:val="nil"/>
+          <w:bottom w:val="nil"/>
+          <w:right w:val="nil"/>
+          <w:between w:val="nil"/>
+        </w:pBdr>
+        <w:spacing w:after="0" w:line="480" w:lineRule="auto"/>
+        <w:jc w:val="center"/>
+        <w:rPr>
+          <w:rFonts w:ascii="Times New Roman" w:eastAsia="Times New Roman" w:hAnsi="Times New Roman" w:cs="Times New Roman"/>
+          <w:sz w:val="24"/>
+          <w:szCs w:val="24"/>
+          <w:lang w:eastAsia="en-US"/>
+          <w14:ligatures w14:val="none"/>
+        </w:rPr>
+      </w:pPr>
+      <w:r>
+        <w:rPr>
+          <w:rFonts w:ascii="Times New Roman" w:eastAsia="Times New Roman" w:hAnsi="Times New Roman" w:cs="Times New Roman"/>
+          <w:sz w:val="24"/>
+          <w:szCs w:val="24"/>
+          <w:lang w:eastAsia="en-US"/>
+          <w14:ligatures w14:val="none"/>
+        </w:rPr>
+        <w:drawing>
+          <wp:inline distT="0" distB="0" distL="0" distR="0" wp14:anchorId="4447519C" wp14:editId="7F129FF1">
+            <wp:extent cx="2305372" cy="933580"/>
+            <wp:effectExtent l="0" t="0" r="0" b="0"/>
+            <wp:docPr id="439886092" name="Imagen 1"/>
+            <wp:cNvGraphicFramePr>
+              <a:graphicFrameLocks xmlns:a="http://schemas.openxmlformats.org/drawingml/2006/main" noChangeAspect="1"/>
+            </wp:cNvGraphicFramePr>
+            <a:graphic xmlns:a="http://schemas.openxmlformats.org/drawingml/2006/main">
+              <a:graphicData uri="http://schemas.openxmlformats.org/drawingml/2006/picture">
+                <pic:pic xmlns:pic="http://schemas.openxmlformats.org/drawingml/2006/picture">
+                  <pic:nvPicPr>
+                    <pic:cNvPr id="439886092" name=""/>
+                    <pic:cNvPicPr/>
+                  </pic:nvPicPr>
+                  <pic:blipFill>
+                    <a:blip r:embed="rId32"/>
+                    <a:stretch>
+                      <a:fillRect/>
+                    </a:stretch>
+                  </pic:blipFill>
+                  <pic:spPr>
+                    <a:xfrm>
+                      <a:off x="0" y="0"/>
+                      <a:ext cx="2305372" cy="933580"/>
+                    </a:xfrm>
+                    <a:prstGeom prst="rect">
+                      <a:avLst/>
+                    </a:prstGeom>
+                  </pic:spPr>
+                </pic:pic>
+              </a:graphicData>
+            </a:graphic>
+          </wp:inline>
+        </w:drawing>
+      </w:r>
+    </w:p>
+    <w:p>
+      <w:pPr>
+        <w:pBdr>
+          <w:top w:val="nil"/>
+          <w:left w:val="nil"/>
+          <w:bottom w:val="nil"/>
+          <w:right w:val="nil"/>
+          <w:between w:val="nil"/>
+        </w:pBdr>
+        <w:spacing w:after="0" w:line="480" w:lineRule="auto"/>
+        <w:jc w:val="center"/>
+        <w:rPr>
+          <w:rFonts w:ascii="Times New Roman" w:eastAsia="Times New Roman" w:hAnsi="Times New Roman" w:cs="Times New Roman"/>
+          <w:sz w:val="24"/>
+          <w:szCs w:val="24"/>
+          <w:lang w:eastAsia="en-US"/>
+          <w14:ligatures w14:val="none"/>
+        </w:rPr>
+      </w:pPr>
+    </w:p>
+    <w:p>
+      <w:pPr>
+        <w:pBdr>
+          <w:top w:val="nil"/>
+          <w:left w:val="nil"/>
+          <w:bottom w:val="nil"/>
+          <w:right w:val="nil"/>
+          <w:between w:val="nil"/>
+        </w:pBdr>
+        <w:spacing w:after="0" w:line="480" w:lineRule="auto"/>
+        <w:jc w:val="center"/>
+        <w:rPr>
+          <w:rFonts w:ascii="Times New Roman" w:eastAsia="Times New Roman" w:hAnsi="Times New Roman" w:cs="Times New Roman"/>
+          <w:sz w:val="24"/>
+          <w:szCs w:val="24"/>
+          <w:lang w:eastAsia="en-US"/>
+          <w14:ligatures w14:val="none"/>
+        </w:rPr>
+      </w:pPr>
+      <w:r>
+        <w:rPr>
+          <w:rFonts w:ascii="Times New Roman" w:eastAsia="Times New Roman" w:hAnsi="Times New Roman" w:cs="Times New Roman"/>
+          <w:sz w:val="24"/>
+          <w:szCs w:val="24"/>
+          <w:lang w:eastAsia="en-US"/>
+          <w14:ligatures w14:val="none"/>
+        </w:rPr>
+        <w:drawing>
+          <wp:inline distT="0" distB="0" distL="0" distR="0" wp14:anchorId="1A521912" wp14:editId="5A987D1D">
+            <wp:extent cx="3296110" cy="905001"/>
+            <wp:effectExtent l="0" t="0" r="0" b="9525"/>
+            <wp:docPr id="826308847" name="Imagen 1"/>
+            <wp:cNvGraphicFramePr>
+              <a:graphicFrameLocks xmlns:a="http://schemas.openxmlformats.org/drawingml/2006/main" noChangeAspect="1"/>
+            </wp:cNvGraphicFramePr>
+            <a:graphic xmlns:a="http://schemas.openxmlformats.org/drawingml/2006/main">
+              <a:graphicData uri="http://schemas.openxmlformats.org/drawingml/2006/picture">
+                <pic:pic xmlns:pic="http://schemas.openxmlformats.org/drawingml/2006/picture">
+                  <pic:nvPicPr>
+                    <pic:cNvPr id="826308847" name=""/>
+                    <pic:cNvPicPr/>
+                  </pic:nvPicPr>
+                  <pic:blipFill>
+                    <a:blip r:embed="rId33"/>
+                    <a:stretch>
+                      <a:fillRect/>
+                    </a:stretch>
+                  </pic:blipFill>
+                  <pic:spPr>
+                    <a:xfrm>
+                      <a:off x="0" y="0"/>
+                      <a:ext cx="3296110" cy="905001"/>
+                    </a:xfrm>
+                    <a:prstGeom prst="rect">
+                      <a:avLst/>
+                    </a:prstGeom>
+                  </pic:spPr>
+                </pic:pic>
+              </a:graphicData>
+            </a:graphic>
+          </wp:inline>
+        </w:drawing>
+      </w:r>
+    </w:p>
+    <w:p>
+      <w:pPr>
+        <w:pBdr>
+          <w:top w:val="nil"/>
+          <w:left w:val="nil"/>
+          <w:bottom w:val="nil"/>
+          <w:right w:val="nil"/>
+          <w:between w:val="nil"/>
+        </w:pBdr>
+        <w:spacing w:after="0" w:line="480" w:lineRule="auto"/>
+        <w:jc w:val="center"/>
+        <w:rPr>
+          <w:rFonts w:ascii="Times New Roman" w:eastAsia="Times New Roman" w:hAnsi="Times New Roman" w:cs="Times New Roman"/>
+          <w:sz w:val="24"/>
+          <w:szCs w:val="24"/>
+          <w:lang w:eastAsia="en-US"/>
+          <w14:ligatures w14:val="none"/>
+        </w:rPr>
+      </w:pPr>
+    </w:p>
+    <w:p>
+      <w:pPr>
+        <w:pBdr>
+          <w:top w:val="nil"/>
+          <w:left w:val="nil"/>
+          <w:bottom w:val="nil"/>
+          <w:right w:val="nil"/>
+          <w:between w:val="nil"/>
+        </w:pBdr>
+        <w:spacing w:after="0" w:line="480" w:lineRule="auto"/>
+        <w:jc w:val="center"/>
+        <w:rPr>
+          <w:rFonts w:ascii="Times New Roman" w:eastAsia="Times New Roman" w:hAnsi="Times New Roman" w:cs="Times New Roman"/>
+          <w:sz w:val="24"/>
+          <w:szCs w:val="24"/>
+          <w:lang w:eastAsia="en-US"/>
+          <w14:ligatures w14:val="none"/>
+        </w:rPr>
+      </w:pPr>
+    </w:p>
+    <w:p>
+      <w:pPr>
+        <w:pBdr>
+          <w:top w:val="nil"/>
+          <w:left w:val="nil"/>
+          <w:bottom w:val="nil"/>
+          <w:right w:val="nil"/>
+          <w:between w:val="nil"/>
+        </w:pBdr>
+        <w:spacing w:after="0" w:line="480" w:lineRule="auto"/>
+        <w:jc w:val="center"/>
+        <w:rPr>
+          <w:rFonts w:ascii="Times New Roman" w:eastAsia="Times New Roman" w:hAnsi="Times New Roman" w:cs="Times New Roman"/>
+          <w:sz w:val="24"/>
+          <w:szCs w:val="24"/>
+          <w:lang w:eastAsia="en-US"/>
+          <w14:ligatures w14:val="none"/>
+        </w:rPr>
+      </w:pPr>
+      <w:r>
+        <w:rPr>
+          <w:rFonts w:ascii="Times New Roman" w:eastAsia="Times New Roman" w:hAnsi="Times New Roman" w:cs="Times New Roman"/>
+          <w:sz w:val="24"/>
+          <w:szCs w:val="24"/>
+          <w:lang w:eastAsia="en-US"/>
+          <w14:ligatures w14:val="none"/>
+        </w:rPr>
+        <w:drawing>
+          <wp:inline distT="0" distB="0" distL="0" distR="0" wp14:anchorId="01B1145E" wp14:editId="07989012">
+            <wp:extent cx="8229600" cy="2014220"/>
+            <wp:effectExtent l="0" t="0" r="0" b="5080"/>
+            <wp:docPr id="840931096" name="Imagen 1"/>
+            <wp:cNvGraphicFramePr>
+              <a:graphicFrameLocks xmlns:a="http://schemas.openxmlformats.org/drawingml/2006/main" noChangeAspect="1"/>
+            </wp:cNvGraphicFramePr>
+            <a:graphic xmlns:a="http://schemas.openxmlformats.org/drawingml/2006/main">
+              <a:graphicData uri="http://schemas.openxmlformats.org/drawingml/2006/picture">
+                <pic:pic xmlns:pic="http://schemas.openxmlformats.org/drawingml/2006/picture">
+                  <pic:nvPicPr>
+                    <pic:cNvPr id="840931096" name=""/>
+                    <pic:cNvPicPr/>
+                  </pic:nvPicPr>
+                  <pic:blipFill>
+                    <a:blip r:embed="rId34"/>
+                    <a:stretch>
+                      <a:fillRect/>
+                    </a:stretch>
+                  </pic:blipFill>
+                  <pic:spPr>
+                    <a:xfrm>
+                      <a:off x="0" y="0"/>
+                      <a:ext cx="8229600" cy="2014220"/>
                     </a:xfrm>
                     <a:prstGeom prst="rect">
                       <a:avLst/>

</xml_diff>